<commit_message>
implemented the editor page
</commit_message>
<xml_diff>
--- a/src/assets/file/Case_file.docx
+++ b/src/assets/file/Case_file.docx
@@ -307,6 +307,7 @@
         <w:rPr>
           <w:rStyle w:val="Strong"/>
           <w:rFonts w:ascii="Arial" w:hAnsi="Arial" w:cs="Arial"/>
+          <w:b w:val="0"/>
         </w:rPr>
       </w:pPr>
     </w:p>
@@ -316,16 +317,258 @@
         <w:rPr>
           <w:rStyle w:val="Strong"/>
           <w:rFonts w:ascii="Arial" w:hAnsi="Arial" w:cs="Arial"/>
+          <w:bCs w:val="0"/>
+        </w:rPr>
+      </w:pPr>
+      <w:r>
+        <w:rPr>
+          <w:rStyle w:val="Strong"/>
+          <w:rFonts w:ascii="Arial" w:hAnsi="Arial" w:cs="Arial"/>
+        </w:rPr>
+        <w:t>Suspect Name:</w:t>
+      </w:r>
+      <w:r>
+        <w:rPr>
+          <w:rFonts w:ascii="Arial" w:hAnsi="Arial" w:cs="Arial"/>
+        </w:rPr>
+        <w:t xml:space="preserve"> </w:t>
+      </w:r>
+    </w:p>
+    <w:p>
+      <w:pPr>
+        <w:pStyle w:val="NormalWeb"/>
+        <w:rPr>
+          <w:rStyle w:val="Strong"/>
+          <w:rFonts w:ascii="Arial" w:hAnsi="Arial" w:cs="Arial"/>
           <w:b w:val="0"/>
-          <w:bCs w:val="0"/>
-        </w:rPr>
-      </w:pPr>
-      <w:r>
-        <w:rPr>
-          <w:rStyle w:val="Strong"/>
-          <w:rFonts w:ascii="Arial" w:hAnsi="Arial" w:cs="Arial"/>
-        </w:rPr>
-        <w:t>Suspect Name:</w:t>
+        </w:rPr>
+      </w:pPr>
+    </w:p>
+    <w:p>
+      <w:pPr>
+        <w:pStyle w:val="NormalWeb"/>
+        <w:rPr>
+          <w:rFonts w:ascii="Arial" w:hAnsi="Arial" w:cs="Arial"/>
+        </w:rPr>
+      </w:pPr>
+      <w:r>
+        <w:rPr>
+          <w:rStyle w:val="Strong"/>
+          <w:rFonts w:ascii="Arial" w:hAnsi="Arial" w:cs="Arial"/>
+        </w:rPr>
+        <w:t>Age:</w:t>
+      </w:r>
+    </w:p>
+    <w:p>
+      <w:pPr>
+        <w:pStyle w:val="NormalWeb"/>
+        <w:rPr>
+          <w:rStyle w:val="Strong"/>
+          <w:rFonts w:ascii="Arial" w:hAnsi="Arial" w:cs="Arial"/>
+          <w:b w:val="0"/>
+        </w:rPr>
+      </w:pPr>
+    </w:p>
+    <w:p>
+      <w:pPr>
+        <w:pStyle w:val="NormalWeb"/>
+        <w:rPr>
+          <w:rFonts w:ascii="Arial" w:hAnsi="Arial" w:cs="Arial"/>
+        </w:rPr>
+      </w:pPr>
+      <w:r>
+        <w:rPr>
+          <w:rStyle w:val="Strong"/>
+          <w:rFonts w:ascii="Arial" w:hAnsi="Arial" w:cs="Arial"/>
+        </w:rPr>
+        <w:t>Position</w:t>
+      </w:r>
+      <w:r>
+        <w:rPr>
+          <w:rStyle w:val="Strong"/>
+          <w:rFonts w:ascii="Arial" w:hAnsi="Arial" w:cs="Arial"/>
+        </w:rPr>
+        <w:t>:</w:t>
+      </w:r>
+    </w:p>
+    <w:p>
+      <w:pPr>
+        <w:pStyle w:val="NormalWeb"/>
+        <w:rPr>
+          <w:rStyle w:val="Strong"/>
+          <w:rFonts w:ascii="Arial" w:hAnsi="Arial" w:cs="Arial"/>
+          <w:b w:val="0"/>
+        </w:rPr>
+      </w:pPr>
+    </w:p>
+    <w:p>
+      <w:pPr>
+        <w:pStyle w:val="NormalWeb"/>
+        <w:rPr>
+          <w:rStyle w:val="Strong"/>
+          <w:rFonts w:ascii="Arial" w:hAnsi="Arial" w:cs="Arial"/>
+        </w:rPr>
+      </w:pPr>
+      <w:r>
+        <w:rPr>
+          <w:rStyle w:val="Strong"/>
+          <w:rFonts w:ascii="Arial" w:hAnsi="Arial" w:cs="Arial"/>
+        </w:rPr>
+        <w:t>1</w:t>
+      </w:r>
+      <w:r>
+        <w:rPr>
+          <w:rStyle w:val="Strong"/>
+          <w:rFonts w:ascii="Arial" w:hAnsi="Arial" w:cs="Arial"/>
+        </w:rPr>
+        <w:t>. Allegation Summary</w:t>
+      </w:r>
+    </w:p>
+    <w:p>
+      <w:pPr>
+        <w:pStyle w:val="NormalWeb"/>
+        <w:rPr>
+          <w:rFonts w:ascii="Arial" w:hAnsi="Arial" w:cs="Arial"/>
+        </w:rPr>
+      </w:pPr>
+    </w:p>
+    <w:p>
+      <w:pPr>
+        <w:pStyle w:val="NormalWeb"/>
+        <w:rPr>
+          <w:rFonts w:ascii="Arial" w:hAnsi="Arial" w:cs="Arial"/>
+        </w:rPr>
+      </w:pPr>
+      <w:r>
+        <w:rPr>
+          <w:rStyle w:val="Strong"/>
+          <w:rFonts w:ascii="Arial" w:hAnsi="Arial" w:cs="Arial"/>
+        </w:rPr>
+        <w:t>2</w:t>
+      </w:r>
+      <w:r>
+        <w:rPr>
+          <w:rStyle w:val="Strong"/>
+          <w:rFonts w:ascii="Arial" w:hAnsi="Arial" w:cs="Arial"/>
+        </w:rPr>
+        <w:t>. Investigation Findings</w:t>
+      </w:r>
+      <w:r>
+        <w:rPr>
+          <w:rFonts w:ascii="Arial" w:hAnsi="Arial" w:cs="Arial"/>
+        </w:rPr>
+        <w:br/>
+      </w:r>
+    </w:p>
+    <w:p>
+      <w:pPr>
+        <w:pStyle w:val="NormalWeb"/>
+        <w:rPr>
+          <w:rFonts w:ascii="Arial" w:hAnsi="Arial" w:cs="Arial"/>
+        </w:rPr>
+      </w:pPr>
+      <w:r>
+        <w:rPr>
+          <w:rStyle w:val="Strong"/>
+          <w:rFonts w:ascii="Arial" w:hAnsi="Arial" w:cs="Arial"/>
+        </w:rPr>
+        <w:t>3</w:t>
+      </w:r>
+      <w:r>
+        <w:rPr>
+          <w:rStyle w:val="Strong"/>
+          <w:rFonts w:ascii="Arial" w:hAnsi="Arial" w:cs="Arial"/>
+        </w:rPr>
+        <w:t>. Evidence Collected</w:t>
+      </w:r>
+      <w:r>
+        <w:rPr>
+          <w:rFonts w:ascii="Arial" w:hAnsi="Arial" w:cs="Arial"/>
+        </w:rPr>
+        <w:br/>
+      </w:r>
+    </w:p>
+    <w:p>
+      <w:pPr>
+        <w:pStyle w:val="NormalWeb"/>
+        <w:rPr>
+          <w:rFonts w:ascii="Arial" w:hAnsi="Arial" w:cs="Arial"/>
+        </w:rPr>
+      </w:pPr>
+      <w:r>
+        <w:rPr>
+          <w:rStyle w:val="Strong"/>
+          <w:rFonts w:ascii="Arial" w:hAnsi="Arial" w:cs="Arial"/>
+        </w:rPr>
+        <w:t>4</w:t>
+      </w:r>
+      <w:r>
+        <w:rPr>
+          <w:rStyle w:val="Strong"/>
+          <w:rFonts w:ascii="Arial" w:hAnsi="Arial" w:cs="Arial"/>
+        </w:rPr>
+        <w:t>. Observations</w:t>
+      </w:r>
+      <w:r>
+        <w:rPr>
+          <w:rFonts w:ascii="Arial" w:hAnsi="Arial" w:cs="Arial"/>
+        </w:rPr>
+        <w:br/>
+      </w:r>
+    </w:p>
+    <w:p>
+      <w:pPr>
+        <w:pStyle w:val="NormalWeb"/>
+        <w:rPr>
+          <w:rStyle w:val="Strong"/>
+          <w:rFonts w:ascii="Arial" w:hAnsi="Arial" w:cs="Arial"/>
+        </w:rPr>
+      </w:pPr>
+      <w:r>
+        <w:rPr>
+          <w:rStyle w:val="Strong"/>
+          <w:rFonts w:ascii="Arial" w:hAnsi="Arial" w:cs="Arial"/>
+        </w:rPr>
+        <w:t>5</w:t>
+      </w:r>
+      <w:r>
+        <w:rPr>
+          <w:rStyle w:val="Strong"/>
+          <w:rFonts w:ascii="Arial" w:hAnsi="Arial" w:cs="Arial"/>
+        </w:rPr>
+        <w:t>. Recommendation / Conclusion</w:t>
+      </w:r>
+      <w:r>
+        <w:rPr>
+          <w:rFonts w:ascii="Arial" w:hAnsi="Arial" w:cs="Arial"/>
+        </w:rPr>
+        <w:br/>
+      </w:r>
+    </w:p>
+    <w:p>
+      <w:pPr>
+        <w:pStyle w:val="NormalWeb"/>
+        <w:rPr>
+          <w:rStyle w:val="Strong"/>
+          <w:rFonts w:ascii="Arial" w:hAnsi="Arial" w:cs="Arial"/>
+          <w:b w:val="0"/>
+        </w:rPr>
+      </w:pPr>
+    </w:p>
+    <w:p>
+      <w:pPr>
+        <w:pStyle w:val="NormalWeb"/>
+        <w:rPr>
+          <w:rFonts w:ascii="Arial" w:hAnsi="Arial" w:cs="Arial"/>
+          <w:bCs/>
+        </w:rPr>
+      </w:pPr>
+      <w:r>
+        <w:rPr>
+          <w:rStyle w:val="Strong"/>
+          <w:rFonts w:ascii="Arial" w:hAnsi="Arial" w:cs="Arial"/>
+        </w:rPr>
+        <w:t>Investigating Officer Name:</w:t>
       </w:r>
       <w:r>
         <w:rPr>
@@ -338,7 +581,6 @@
       <w:pPr>
         <w:pStyle w:val="NormalWeb"/>
         <w:rPr>
-          <w:rStyle w:val="Strong"/>
           <w:rFonts w:ascii="Arial" w:hAnsi="Arial" w:cs="Arial"/>
         </w:rPr>
       </w:pPr>
@@ -348,285 +590,32 @@
         <w:pStyle w:val="NormalWeb"/>
         <w:rPr>
           <w:rFonts w:ascii="Arial" w:hAnsi="Arial" w:cs="Arial"/>
-        </w:rPr>
-      </w:pPr>
-      <w:r>
-        <w:rPr>
-          <w:rStyle w:val="Strong"/>
-          <w:rFonts w:ascii="Arial" w:hAnsi="Arial" w:cs="Arial"/>
-        </w:rPr>
-        <w:t>Age:</w:t>
-      </w:r>
-      <w:r>
-        <w:rPr>
-          <w:rFonts w:ascii="Arial" w:hAnsi="Arial" w:cs="Arial"/>
+          <w:b/>
+        </w:rPr>
+      </w:pPr>
+      <w:r>
+        <w:rPr>
+          <w:rFonts w:ascii="Arial" w:hAnsi="Arial" w:cs="Arial"/>
+          <w:b/>
+        </w:rPr>
+        <w:t>Designation</w:t>
+      </w:r>
+      <w:r>
+        <w:rPr>
+          <w:rFonts w:ascii="Arial" w:hAnsi="Arial" w:cs="Arial"/>
+          <w:b/>
+        </w:rPr>
+        <w:t>:</w:t>
+      </w:r>
+      <w:r>
+        <w:rPr>
+          <w:rFonts w:ascii="Arial" w:hAnsi="Arial" w:cs="Arial"/>
+          <w:b/>
         </w:rPr>
         <w:t xml:space="preserve"> </w:t>
       </w:r>
-    </w:p>
-    <w:p>
-      <w:pPr>
-        <w:pStyle w:val="NormalWeb"/>
-        <w:rPr>
-          <w:rStyle w:val="Strong"/>
-          <w:rFonts w:ascii="Arial" w:hAnsi="Arial" w:cs="Arial"/>
-        </w:rPr>
-      </w:pPr>
-    </w:p>
-    <w:p>
-      <w:pPr>
-        <w:pStyle w:val="NormalWeb"/>
-        <w:rPr>
-          <w:rFonts w:ascii="Arial" w:hAnsi="Arial" w:cs="Arial"/>
-        </w:rPr>
-      </w:pPr>
-      <w:r>
-        <w:rPr>
-          <w:rStyle w:val="Strong"/>
-          <w:rFonts w:ascii="Arial" w:hAnsi="Arial" w:cs="Arial"/>
-        </w:rPr>
-        <w:t>Position</w:t>
-      </w:r>
-      <w:r>
-        <w:rPr>
-          <w:rStyle w:val="Strong"/>
-          <w:rFonts w:ascii="Arial" w:hAnsi="Arial" w:cs="Arial"/>
-        </w:rPr>
-        <w:t>:</w:t>
-      </w:r>
-      <w:r>
-        <w:rPr>
-          <w:rFonts w:ascii="Arial" w:hAnsi="Arial" w:cs="Arial"/>
-        </w:rPr>
-        <w:t xml:space="preserve"> </w:t>
-      </w:r>
-    </w:p>
-    <w:p>
-      <w:pPr>
-        <w:pStyle w:val="NormalWeb"/>
-        <w:rPr>
-          <w:rStyle w:val="Strong"/>
-          <w:rFonts w:ascii="Arial" w:hAnsi="Arial" w:cs="Arial"/>
-        </w:rPr>
-      </w:pPr>
-    </w:p>
-    <w:p>
-      <w:pPr>
-        <w:pStyle w:val="NormalWeb"/>
-        <w:rPr>
-          <w:rStyle w:val="Strong"/>
-          <w:rFonts w:ascii="Arial" w:hAnsi="Arial" w:cs="Arial"/>
-        </w:rPr>
-      </w:pPr>
-      <w:r>
-        <w:rPr>
-          <w:rStyle w:val="Strong"/>
-          <w:rFonts w:ascii="Arial" w:hAnsi="Arial" w:cs="Arial"/>
-        </w:rPr>
-        <w:t>1</w:t>
-      </w:r>
-      <w:r>
-        <w:rPr>
-          <w:rStyle w:val="Strong"/>
-          <w:rFonts w:ascii="Arial" w:hAnsi="Arial" w:cs="Arial"/>
-        </w:rPr>
-        <w:t>. Allegation Summary</w:t>
-      </w:r>
-    </w:p>
-    <w:p>
-      <w:pPr>
-        <w:pStyle w:val="NormalWeb"/>
-        <w:rPr>
-          <w:rFonts w:ascii="Arial" w:hAnsi="Arial" w:cs="Arial"/>
-        </w:rPr>
-      </w:pPr>
-    </w:p>
-    <w:p>
-      <w:pPr>
-        <w:pStyle w:val="NormalWeb"/>
-        <w:rPr>
-          <w:rFonts w:ascii="Arial" w:hAnsi="Arial" w:cs="Arial"/>
-        </w:rPr>
-      </w:pPr>
-      <w:r>
-        <w:rPr>
-          <w:rStyle w:val="Strong"/>
-          <w:rFonts w:ascii="Arial" w:hAnsi="Arial" w:cs="Arial"/>
-        </w:rPr>
-        <w:t>2</w:t>
-      </w:r>
-      <w:r>
-        <w:rPr>
-          <w:rStyle w:val="Strong"/>
-          <w:rFonts w:ascii="Arial" w:hAnsi="Arial" w:cs="Arial"/>
-        </w:rPr>
-        <w:t>. Investigation Findings</w:t>
-      </w:r>
-      <w:r>
-        <w:rPr>
-          <w:rFonts w:ascii="Arial" w:hAnsi="Arial" w:cs="Arial"/>
-        </w:rPr>
-        <w:br/>
-      </w:r>
-    </w:p>
-    <w:p>
-      <w:pPr>
-        <w:pStyle w:val="NormalWeb"/>
-        <w:rPr>
-          <w:rFonts w:ascii="Arial" w:hAnsi="Arial" w:cs="Arial"/>
-        </w:rPr>
-      </w:pPr>
-      <w:r>
-        <w:rPr>
-          <w:rStyle w:val="Strong"/>
-          <w:rFonts w:ascii="Arial" w:hAnsi="Arial" w:cs="Arial"/>
-        </w:rPr>
-        <w:t>3</w:t>
-      </w:r>
-      <w:r>
-        <w:rPr>
-          <w:rStyle w:val="Strong"/>
-          <w:rFonts w:ascii="Arial" w:hAnsi="Arial" w:cs="Arial"/>
-        </w:rPr>
-        <w:t>. Evidence Collected</w:t>
-      </w:r>
-      <w:r>
-        <w:rPr>
-          <w:rFonts w:ascii="Arial" w:hAnsi="Arial" w:cs="Arial"/>
-        </w:rPr>
-        <w:br/>
-      </w:r>
-    </w:p>
-    <w:p>
-      <w:pPr>
-        <w:pStyle w:val="NormalWeb"/>
-        <w:rPr>
-          <w:rFonts w:ascii="Arial" w:hAnsi="Arial" w:cs="Arial"/>
-        </w:rPr>
-      </w:pPr>
-      <w:r>
-        <w:rPr>
-          <w:rStyle w:val="Strong"/>
-          <w:rFonts w:ascii="Arial" w:hAnsi="Arial" w:cs="Arial"/>
-        </w:rPr>
-        <w:t>4</w:t>
-      </w:r>
-      <w:r>
-        <w:rPr>
-          <w:rStyle w:val="Strong"/>
-          <w:rFonts w:ascii="Arial" w:hAnsi="Arial" w:cs="Arial"/>
-        </w:rPr>
-        <w:t>. Observations</w:t>
-      </w:r>
-      <w:r>
-        <w:rPr>
-          <w:rFonts w:ascii="Arial" w:hAnsi="Arial" w:cs="Arial"/>
-        </w:rPr>
-        <w:br/>
-      </w:r>
-    </w:p>
-    <w:p>
-      <w:pPr>
-        <w:pStyle w:val="NormalWeb"/>
-        <w:rPr>
-          <w:rStyle w:val="Strong"/>
-          <w:rFonts w:ascii="Arial" w:hAnsi="Arial" w:cs="Arial"/>
-        </w:rPr>
-      </w:pPr>
-      <w:r>
-        <w:rPr>
-          <w:rStyle w:val="Strong"/>
-          <w:rFonts w:ascii="Arial" w:hAnsi="Arial" w:cs="Arial"/>
-        </w:rPr>
-        <w:t>5</w:t>
-      </w:r>
-      <w:r>
-        <w:rPr>
-          <w:rStyle w:val="Strong"/>
-          <w:rFonts w:ascii="Arial" w:hAnsi="Arial" w:cs="Arial"/>
-        </w:rPr>
-        <w:t>. Recommendation / Conclusion</w:t>
-      </w:r>
-      <w:r>
-        <w:rPr>
-          <w:rFonts w:ascii="Arial" w:hAnsi="Arial" w:cs="Arial"/>
-        </w:rPr>
-        <w:br/>
-      </w:r>
-    </w:p>
-    <w:p>
-      <w:pPr>
-        <w:pStyle w:val="NormalWeb"/>
-        <w:rPr>
-          <w:rStyle w:val="Strong"/>
-          <w:rFonts w:ascii="Arial" w:hAnsi="Arial" w:cs="Arial"/>
-        </w:rPr>
-      </w:pPr>
-    </w:p>
-    <w:p>
-      <w:pPr>
-        <w:pStyle w:val="NormalWeb"/>
-        <w:rPr>
-          <w:rFonts w:ascii="Arial" w:hAnsi="Arial" w:cs="Arial"/>
-          <w:b/>
-          <w:bCs/>
-        </w:rPr>
-      </w:pPr>
-      <w:r>
-        <w:rPr>
-          <w:rStyle w:val="Strong"/>
-          <w:rFonts w:ascii="Arial" w:hAnsi="Arial" w:cs="Arial"/>
-        </w:rPr>
-        <w:t>Investigating Officer Name:</w:t>
-      </w:r>
-      <w:r>
-        <w:rPr>
-          <w:rFonts w:ascii="Arial" w:hAnsi="Arial" w:cs="Arial"/>
-        </w:rPr>
-        <w:t xml:space="preserve"> </w:t>
-      </w:r>
-    </w:p>
-    <w:p>
-      <w:pPr>
-        <w:pStyle w:val="NormalWeb"/>
-        <w:rPr>
-          <w:rFonts w:ascii="Arial" w:hAnsi="Arial" w:cs="Arial"/>
-          <w:b/>
-        </w:rPr>
-      </w:pPr>
-    </w:p>
-    <w:p>
-      <w:pPr>
-        <w:pStyle w:val="NormalWeb"/>
-        <w:rPr>
-          <w:rFonts w:ascii="Arial" w:hAnsi="Arial" w:cs="Arial"/>
-        </w:rPr>
-      </w:pPr>
       <w:bookmarkStart w:id="0" w:name="_GoBack"/>
       <w:bookmarkEnd w:id="0"/>
-      <w:r>
-        <w:rPr>
-          <w:rFonts w:ascii="Arial" w:hAnsi="Arial" w:cs="Arial"/>
-          <w:b/>
-        </w:rPr>
-        <w:t>Designation</w:t>
-      </w:r>
-      <w:r>
-        <w:rPr>
-          <w:rFonts w:ascii="Arial" w:hAnsi="Arial" w:cs="Arial"/>
-        </w:rPr>
-        <w:t xml:space="preserve">: </w:t>
-      </w:r>
-    </w:p>
-    <w:p>
-      <w:pPr>
-        <w:spacing w:after="0" w:line="240" w:lineRule="auto"/>
-        <w:rPr>
-          <w:rFonts w:ascii="Arial" w:eastAsia="Times New Roman" w:hAnsi="Arial" w:cs="Arial"/>
-          <w:b/>
-          <w:color w:val="000000"/>
-        </w:rPr>
-      </w:pPr>
     </w:p>
     <w:sectPr>
       <w:headerReference w:type="default" r:id="rId8"/>

</xml_diff>